<commit_message>
feat: update site for Nigerian registration and law
</commit_message>
<xml_diff>
--- a/src/resources/rhemroyal-business-plan-template.docx
+++ b/src/resources/rhemroyal-business-plan-template.docx
@@ -1918,7 +1918,7 @@
           <w:sz w:val="21"/>
           <w:szCs w:val="21"/>
         </w:rPr>
-        <w:t xml:space="preserve">General planning guidance — not regulated financial advice. Speak to an accountant for formal financial statements.</w:t>
+        <w:t xml:space="preserve">General planning guidance — not regulated financial advice. Use your own currency throughout, and speak to an accountant for formal financial statements.</w:t>
       </w:r>
     </w:p>
     <w:p>
@@ -2058,7 +2058,7 @@
                 <w:sz w:val="20"/>
                 <w:szCs w:val="20"/>
               </w:rPr>
-              <w:t xml:space="preserve">[£ amount]</w:t>
+              <w:t xml:space="preserve">[amount]</w:t>
             </w:r>
           </w:p>
         </w:tc>
@@ -2112,7 +2112,7 @@
                 <w:sz w:val="20"/>
                 <w:szCs w:val="20"/>
               </w:rPr>
-              <w:t xml:space="preserve">[£ amount]</w:t>
+              <w:t xml:space="preserve">[amount]</w:t>
             </w:r>
           </w:p>
         </w:tc>
@@ -2164,7 +2164,7 @@
                 <w:sz w:val="20"/>
                 <w:szCs w:val="20"/>
               </w:rPr>
-              <w:t xml:space="preserve">[£ amount]</w:t>
+              <w:t xml:space="preserve">[amount]</w:t>
             </w:r>
           </w:p>
         </w:tc>
@@ -2449,7 +2449,7 @@
                 <w:sz w:val="20"/>
                 <w:szCs w:val="20"/>
               </w:rPr>
-              <w:t xml:space="preserve">£</w:t>
+              <w:t xml:space="preserve"/>
             </w:r>
           </w:p>
         </w:tc>
@@ -2474,7 +2474,7 @@
                 <w:sz w:val="20"/>
                 <w:szCs w:val="20"/>
               </w:rPr>
-              <w:t xml:space="preserve">£</w:t>
+              <w:t xml:space="preserve"/>
             </w:r>
           </w:p>
         </w:tc>
@@ -2499,7 +2499,7 @@
                 <w:sz w:val="20"/>
                 <w:szCs w:val="20"/>
               </w:rPr>
-              <w:t xml:space="preserve">£</w:t>
+              <w:t xml:space="preserve"/>
             </w:r>
           </w:p>
         </w:tc>
@@ -2524,7 +2524,7 @@
                 <w:sz w:val="20"/>
                 <w:szCs w:val="20"/>
               </w:rPr>
-              <w:t xml:space="preserve">£</w:t>
+              <w:t xml:space="preserve"/>
             </w:r>
           </w:p>
         </w:tc>
@@ -2549,7 +2549,7 @@
                 <w:sz w:val="20"/>
                 <w:szCs w:val="20"/>
               </w:rPr>
-              <w:t xml:space="preserve">£</w:t>
+              <w:t xml:space="preserve"/>
             </w:r>
           </w:p>
         </w:tc>
@@ -2574,7 +2574,7 @@
                 <w:sz w:val="20"/>
                 <w:szCs w:val="20"/>
               </w:rPr>
-              <w:t xml:space="preserve">£</w:t>
+              <w:t xml:space="preserve"/>
             </w:r>
           </w:p>
         </w:tc>

</xml_diff>